<commit_message>
update EFV source doc to use H1 style appropriately
</commit_message>
<xml_diff>
--- a/sources/EFV TechDoc - V3.docx
+++ b/sources/EFV TechDoc - V3.docx
@@ -1,6 +1,6 @@
 
 <file path=word/document.xml><?xml version="1.0" encoding="utf-8"?>
-<w:document xmlns:wpc="http://schemas.microsoft.com/office/word/2010/wordprocessingCanvas" xmlns:cx="http://schemas.microsoft.com/office/drawing/2014/chartex" xmlns:cx1="http://schemas.microsoft.com/office/drawing/2015/9/8/chartex" xmlns:cx2="http://schemas.microsoft.com/office/drawing/2015/10/21/chartex" xmlns:cx3="http://schemas.microsoft.com/office/drawing/2016/5/9/chartex" xmlns:cx4="http://schemas.microsoft.com/office/drawing/2016/5/10/chartex" xmlns:cx5="http://schemas.microsoft.com/office/drawing/2016/5/11/chartex" xmlns:cx6="http://schemas.microsoft.com/office/drawing/2016/5/12/chartex" xmlns:cx7="http://schemas.microsoft.com/office/drawing/2016/5/13/chartex" xmlns:cx8="http://schemas.microsoft.com/office/drawing/2016/5/14/chartex" xmlns:mc="http://schemas.openxmlformats.org/markup-compatibility/2006" xmlns:aink="http://schemas.microsoft.com/office/drawing/2016/ink" xmlns:am3d="http://schemas.microsoft.com/office/drawing/2017/model3d" xmlns:o="urn:schemas-microsoft-com:office:office" xmlns:oel="http://schemas.microsoft.com/office/2019/extlst" xmlns:r="http://schemas.openxmlformats.org/officeDocument/2006/relationships" xmlns:m="http://schemas.openxmlformats.org/officeDocument/2006/math" xmlns:v="urn:schemas-microsoft-com:vml" xmlns:wp14="http://schemas.microsoft.com/office/word/2010/wordprocessingDrawing" xmlns:wp="http://schemas.openxmlformats.org/drawingml/2006/wordprocessingDrawing" xmlns:w10="urn:schemas-microsoft-com:office:word" xmlns:w="http://schemas.openxmlformats.org/wordprocessingml/2006/main" xmlns:w14="http://schemas.microsoft.com/office/word/2010/wordml" xmlns:w15="http://schemas.microsoft.com/office/word/2012/wordml" xmlns:w16cex="http://schemas.microsoft.com/office/word/2018/wordml/cex" xmlns:w16cid="http://schemas.microsoft.com/office/word/2016/wordml/cid" xmlns:w16="http://schemas.microsoft.com/office/word/2018/wordml" xmlns:w16du="http://schemas.microsoft.com/office/word/2023/wordml/word16du" xmlns:w16sdtdh="http://schemas.microsoft.com/office/word/2020/wordml/sdtdatahash" xmlns:w16sdtfl="http://schemas.microsoft.com/office/word/2024/wordml/sdtformatlock" xmlns:w16se="http://schemas.microsoft.com/office/word/2015/wordml/symex" xmlns:wpg="http://schemas.microsoft.com/office/word/2010/wordprocessingGroup" xmlns:wpi="http://schemas.microsoft.com/office/word/2010/wordprocessingInk" xmlns:wne="http://schemas.microsoft.com/office/word/2006/wordml" xmlns:wps="http://schemas.microsoft.com/office/word/2010/wordprocessingShape" mc:Ignorable="w14 w15 w16se w16cid w16 w16cex w16sdtdh w16sdtfl w16du wp14">
+<w:document xmlns:wpc="http://schemas.microsoft.com/office/word/2010/wordprocessingCanvas" xmlns:cx="http://schemas.microsoft.com/office/drawing/2014/chartex" xmlns:cx1="http://schemas.microsoft.com/office/drawing/2015/9/8/chartex" xmlns:cx2="http://schemas.microsoft.com/office/drawing/2015/10/21/chartex" xmlns:cx3="http://schemas.microsoft.com/office/drawing/2016/5/9/chartex" xmlns:cx4="http://schemas.microsoft.com/office/drawing/2016/5/10/chartex" xmlns:cx5="http://schemas.microsoft.com/office/drawing/2016/5/11/chartex" xmlns:cx6="http://schemas.microsoft.com/office/drawing/2016/5/12/chartex" xmlns:cx7="http://schemas.microsoft.com/office/drawing/2016/5/13/chartex" xmlns:cx8="http://schemas.microsoft.com/office/drawing/2016/5/14/chartex" xmlns:mc="http://schemas.openxmlformats.org/markup-compatibility/2006" xmlns:m="http://schemas.openxmlformats.org/officeDocument/2006/math" xmlns:aink="http://schemas.microsoft.com/office/drawing/2016/ink" xmlns:am3d="http://schemas.microsoft.com/office/drawing/2017/model3d" xmlns:oel="http://schemas.microsoft.com/office/2019/extlst" xmlns:r="http://schemas.openxmlformats.org/officeDocument/2006/relationships" xmlns:wp14="http://schemas.microsoft.com/office/word/2010/wordprocessingDrawing" xmlns:wp="http://schemas.openxmlformats.org/drawingml/2006/wordprocessingDrawing" xmlns:wpg="http://schemas.microsoft.com/office/word/2010/wordprocessingGroup" xmlns:wpi="http://schemas.microsoft.com/office/word/2010/wordprocessingInk" xmlns:wps="http://schemas.microsoft.com/office/word/2010/wordprocessingShape" xmlns:o="urn:schemas-microsoft-com:office:office" xmlns:v="urn:schemas-microsoft-com:vml" xmlns:w10="urn:schemas-microsoft-com:office:word" xmlns:w="http://schemas.openxmlformats.org/wordprocessingml/2006/main" xmlns:w14="http://schemas.microsoft.com/office/word/2010/wordml" xmlns:w15="http://schemas.microsoft.com/office/word/2012/wordml" xmlns:w16cex="http://schemas.microsoft.com/office/word/2018/wordml/cex" xmlns:w16cid="http://schemas.microsoft.com/office/word/2016/wordml/cid" xmlns:w16="http://schemas.microsoft.com/office/word/2018/wordml" xmlns:w16sdtdh="http://schemas.microsoft.com/office/word/2020/wordml/sdtdatahash" xmlns:w16sdtfl="http://schemas.microsoft.com/office/word/2024/wordml/sdtformatlock" xmlns:w16se="http://schemas.microsoft.com/office/word/2015/wordml/symex" xmlns:w16du="http://schemas.microsoft.com/office/word/2023/wordml/word16du" xmlns:wne="http://schemas.microsoft.com/office/word/2006/wordml" mc:Ignorable="w14 w15 w16se w16cid w16 w16cex w16sdtdh w16sdtfl w16du wp14">
   <w:body>
     <w:p>
       <w:pPr>
@@ -13,78 +13,24 @@
       </w:r>
     </w:p>
     <w:p>
-      <w:pPr>
-        <w:pStyle w:val="Heading1"/>
-        <w:rPr>
-          <w:rFonts w:asciiTheme="minorHAnsi" w:eastAsiaTheme="minorHAnsi" w:hAnsiTheme="minorHAnsi" w:cstheme="minorBidi"/>
-          <w:color w:val="auto"/>
-          <w:sz w:val="24"/>
-          <w:szCs w:val="24"/>
-        </w:rPr>
-      </w:pPr>
-      <w:r>
-        <w:rPr>
-          <w:rFonts w:asciiTheme="minorHAnsi" w:eastAsiaTheme="minorHAnsi" w:hAnsiTheme="minorHAnsi" w:cstheme="minorBidi"/>
-          <w:color w:val="auto"/>
-          <w:sz w:val="24"/>
-          <w:szCs w:val="24"/>
-        </w:rPr>
+      <w:r>
         <w:t>Eligibility Factor Verification, or EFV, helps government programs check specific facts used in eligibility decisions.</w:t>
       </w:r>
     </w:p>
     <w:p>
-      <w:pPr>
-        <w:pStyle w:val="Heading1"/>
-        <w:rPr>
-          <w:rFonts w:asciiTheme="minorHAnsi" w:eastAsiaTheme="minorHAnsi" w:hAnsiTheme="minorHAnsi" w:cstheme="minorBidi"/>
-          <w:color w:val="auto"/>
-          <w:sz w:val="24"/>
-          <w:szCs w:val="24"/>
-        </w:rPr>
-      </w:pPr>
-      <w:r>
-        <w:rPr>
-          <w:rFonts w:asciiTheme="minorHAnsi" w:eastAsiaTheme="minorHAnsi" w:hAnsiTheme="minorHAnsi" w:cstheme="minorBidi"/>
-          <w:color w:val="auto"/>
-          <w:sz w:val="24"/>
-          <w:szCs w:val="24"/>
-        </w:rPr>
+      <w:r>
         <w:t xml:space="preserve">Many programs need to confirm similar things, such as income, residency, or other information an applicant provides. Today, this can involve manual document review, screenshots, forms, or staff follow-up. EFV is intended to reduce that effort by helping programs check certain facts against </w:t>
       </w:r>
       <w:r>
-        <w:rPr>
-          <w:rFonts w:asciiTheme="minorHAnsi" w:eastAsiaTheme="minorHAnsi" w:hAnsiTheme="minorHAnsi" w:cstheme="minorBidi"/>
-          <w:color w:val="auto"/>
-          <w:sz w:val="24"/>
-          <w:szCs w:val="24"/>
-        </w:rPr>
         <w:t xml:space="preserve">approved or </w:t>
       </w:r>
       <w:r>
-        <w:rPr>
-          <w:rFonts w:asciiTheme="minorHAnsi" w:eastAsiaTheme="minorHAnsi" w:hAnsiTheme="minorHAnsi" w:cstheme="minorBidi"/>
-          <w:color w:val="auto"/>
-          <w:sz w:val="24"/>
-          <w:szCs w:val="24"/>
-        </w:rPr>
         <w:t>trusted data sources</w:t>
       </w:r>
       <w:r>
-        <w:rPr>
-          <w:rFonts w:asciiTheme="minorHAnsi" w:eastAsiaTheme="minorHAnsi" w:hAnsiTheme="minorHAnsi" w:cstheme="minorBidi"/>
-          <w:color w:val="auto"/>
-          <w:sz w:val="24"/>
-          <w:szCs w:val="24"/>
-        </w:rPr>
         <w:t>, where available</w:t>
       </w:r>
       <w:r>
-        <w:rPr>
-          <w:rFonts w:asciiTheme="minorHAnsi" w:eastAsiaTheme="minorHAnsi" w:hAnsiTheme="minorHAnsi" w:cstheme="minorBidi"/>
-          <w:color w:val="auto"/>
-          <w:sz w:val="24"/>
-          <w:szCs w:val="24"/>
-        </w:rPr>
         <w:t>.</w:t>
       </w:r>
     </w:p>
@@ -104,97 +50,32 @@
         <w:t xml:space="preserve"> </w:t>
       </w:r>
       <w:r>
-        <w:t xml:space="preserve">The program still </w:t>
-      </w:r>
-      <w:proofErr w:type="gramStart"/>
-      <w:r>
-        <w:t>owns</w:t>
-      </w:r>
-      <w:proofErr w:type="gramEnd"/>
-      <w:r>
-        <w:t xml:space="preserve"> its eligibility rules and makes the final decision.</w:t>
-      </w:r>
-    </w:p>
-    <w:p>
-      <w:pPr>
-        <w:pStyle w:val="Heading1"/>
-        <w:rPr>
-          <w:rFonts w:asciiTheme="minorHAnsi" w:eastAsiaTheme="minorHAnsi" w:hAnsiTheme="minorHAnsi" w:cstheme="minorBidi"/>
-          <w:color w:val="auto"/>
-          <w:sz w:val="24"/>
-          <w:szCs w:val="24"/>
-        </w:rPr>
-      </w:pPr>
-      <w:r>
-        <w:rPr>
-          <w:rFonts w:asciiTheme="minorHAnsi" w:eastAsiaTheme="minorHAnsi" w:hAnsiTheme="minorHAnsi" w:cstheme="minorBidi"/>
-          <w:color w:val="auto"/>
-          <w:sz w:val="24"/>
-          <w:szCs w:val="24"/>
-        </w:rPr>
+        <w:t>The program still owns its eligibility rules and makes the final decision.</w:t>
+      </w:r>
+    </w:p>
+    <w:p>
+      <w:r>
         <w:t>EFV can support a program by returning a verification result and related information, such as the source used, when the check happened, and any limits or caveats that apply. Program staff or systems can then use that result to support a decision, focus review on exceptions, or reduce the need for applicants to provide documents.</w:t>
       </w:r>
       <w:r>
-        <w:rPr>
-          <w:rFonts w:asciiTheme="minorHAnsi" w:eastAsiaTheme="minorHAnsi" w:hAnsiTheme="minorHAnsi" w:cstheme="minorBidi"/>
-          <w:color w:val="auto"/>
-          <w:sz w:val="24"/>
-          <w:szCs w:val="24"/>
-        </w:rPr>
         <w:br/>
       </w:r>
       <w:r>
-        <w:rPr>
-          <w:rFonts w:asciiTheme="minorHAnsi" w:eastAsiaTheme="minorHAnsi" w:hAnsiTheme="minorHAnsi" w:cstheme="minorBidi"/>
-          <w:color w:val="auto"/>
-          <w:sz w:val="24"/>
-          <w:szCs w:val="24"/>
-        </w:rPr>
         <w:br/>
       </w:r>
       <w:r>
-        <w:rPr>
-          <w:rFonts w:asciiTheme="minorHAnsi" w:eastAsiaTheme="minorHAnsi" w:hAnsiTheme="minorHAnsi" w:cstheme="minorBidi"/>
-          <w:color w:val="auto"/>
-          <w:sz w:val="24"/>
-          <w:szCs w:val="24"/>
-        </w:rPr>
         <w:t>EFV is in early development. The first focus is income verification.</w:t>
       </w:r>
       <w:r>
-        <w:rPr>
-          <w:rFonts w:asciiTheme="minorHAnsi" w:eastAsiaTheme="minorHAnsi" w:hAnsiTheme="minorHAnsi" w:cstheme="minorBidi"/>
-          <w:color w:val="auto"/>
-          <w:sz w:val="24"/>
-          <w:szCs w:val="24"/>
-        </w:rPr>
         <w:t xml:space="preserve"> </w:t>
       </w:r>
       <w:r>
-        <w:rPr>
-          <w:rFonts w:asciiTheme="minorHAnsi" w:eastAsiaTheme="minorHAnsi" w:hAnsiTheme="minorHAnsi" w:cstheme="minorBidi"/>
-          <w:color w:val="auto"/>
-          <w:sz w:val="24"/>
-          <w:szCs w:val="24"/>
-        </w:rPr>
         <w:t>Future eligibility factors may be explored over time based on program need, source availability, agreements, policy authority, privacy and security requirements, and technical feasibility.</w:t>
       </w:r>
       <w:r>
-        <w:rPr>
-          <w:rFonts w:asciiTheme="minorHAnsi" w:eastAsiaTheme="minorHAnsi" w:hAnsiTheme="minorHAnsi" w:cstheme="minorBidi"/>
-          <w:color w:val="auto"/>
-          <w:sz w:val="24"/>
-          <w:szCs w:val="24"/>
-        </w:rPr>
         <w:br/>
       </w:r>
       <w:r>
-        <w:rPr>
-          <w:rFonts w:asciiTheme="minorHAnsi" w:eastAsiaTheme="minorHAnsi" w:hAnsiTheme="minorHAnsi" w:cstheme="minorBidi"/>
-          <w:color w:val="auto"/>
-          <w:sz w:val="24"/>
-          <w:szCs w:val="24"/>
-        </w:rPr>
         <w:br/>
       </w:r>
       <w:r>
@@ -247,23 +128,7 @@
         <w:ind w:left="720"/>
       </w:pPr>
       <w:r>
-        <w:t xml:space="preserve">With EFV, the program may be able to request an income verification check through a trusted source. The program receives </w:t>
-      </w:r>
-      <w:proofErr w:type="gramStart"/>
-      <w:r>
-        <w:t>a result</w:t>
-      </w:r>
-      <w:proofErr w:type="gramEnd"/>
-      <w:r>
-        <w:t xml:space="preserve"> and </w:t>
-      </w:r>
-      <w:proofErr w:type="gramStart"/>
-      <w:r>
-        <w:t>supporting</w:t>
-      </w:r>
-      <w:proofErr w:type="gramEnd"/>
-      <w:r>
-        <w:t xml:space="preserve"> details. The program then applies its own rules and decides what happens next.</w:t>
+        <w:t>With EFV, the program may be able to request an income verification check through a trusted source. The program receives a result and supporting details. The program then applies its own rules and decides what happens next.</w:t>
       </w:r>
     </w:p>
     <w:p>
@@ -293,15 +158,7 @@
         </w:r>
       </w:hyperlink>
       <w:r>
-        <w:t xml:space="preserve"> with a clear use case. The team can help determine whether EFV is a good fit, whether an existing verification factor is available, and what other teams or approvals may be </w:t>
-      </w:r>
-      <w:proofErr w:type="gramStart"/>
-      <w:r>
-        <w:t>involved</w:t>
-      </w:r>
-      <w:proofErr w:type="gramEnd"/>
-      <w:r>
-        <w:t>.</w:t>
+        <w:t xml:space="preserve"> with a clear use case. The team can help determine whether EFV is a good fit, whether an existing verification factor is available, and what other teams or approvals may be involved.</w:t>
       </w:r>
     </w:p>
     <w:p>
@@ -387,15 +244,7 @@
         </w:numPr>
       </w:pPr>
       <w:r>
-        <w:t xml:space="preserve">Help staff focus on exceptions or </w:t>
-      </w:r>
-      <w:proofErr w:type="gramStart"/>
-      <w:r>
-        <w:t>higher-risk</w:t>
-      </w:r>
-      <w:proofErr w:type="gramEnd"/>
-      <w:r>
-        <w:t xml:space="preserve"> cases</w:t>
+        <w:t>Help staff focus on exceptions or higher-risk cases</w:t>
       </w:r>
     </w:p>
     <w:p>
@@ -904,69 +753,21 @@
       </w:r>
     </w:p>
     <w:p>
-      <w:pPr>
-        <w:pStyle w:val="Heading1"/>
-        <w:rPr>
-          <w:rFonts w:asciiTheme="minorHAnsi" w:eastAsiaTheme="minorHAnsi" w:hAnsiTheme="minorHAnsi" w:cstheme="minorBidi"/>
-          <w:color w:val="auto"/>
-          <w:sz w:val="24"/>
-          <w:szCs w:val="24"/>
-        </w:rPr>
-      </w:pPr>
-      <w:r>
-        <w:rPr>
-          <w:rFonts w:asciiTheme="minorHAnsi" w:eastAsiaTheme="minorHAnsi" w:hAnsiTheme="minorHAnsi" w:cstheme="minorBidi"/>
-          <w:color w:val="auto"/>
-          <w:sz w:val="24"/>
-          <w:szCs w:val="24"/>
-        </w:rPr>
+      <w:r>
         <w:t xml:space="preserve">Data providers need confidence that their information will only be requested and used for an approved purpose and under the required conditions. </w:t>
       </w:r>
       <w:r>
-        <w:rPr>
-          <w:rFonts w:asciiTheme="minorHAnsi" w:eastAsiaTheme="minorHAnsi" w:hAnsiTheme="minorHAnsi" w:cstheme="minorBidi"/>
-          <w:color w:val="auto"/>
-          <w:sz w:val="24"/>
-          <w:szCs w:val="24"/>
-        </w:rPr>
         <w:t>As part of developing an eligibility factor, the EFV team can help identify what requirements may need to be supported. This may include technical, legal, privacy, consent, agreement, and business requirements.</w:t>
       </w:r>
       <w:r>
-        <w:rPr>
-          <w:rFonts w:asciiTheme="minorHAnsi" w:eastAsiaTheme="minorHAnsi" w:hAnsiTheme="minorHAnsi" w:cstheme="minorBidi"/>
-          <w:color w:val="auto"/>
-          <w:sz w:val="24"/>
-          <w:szCs w:val="24"/>
-        </w:rPr>
         <w:t xml:space="preserve"> </w:t>
       </w:r>
       <w:r>
-        <w:rPr>
-          <w:rFonts w:asciiTheme="minorHAnsi" w:eastAsiaTheme="minorHAnsi" w:hAnsiTheme="minorHAnsi" w:cstheme="minorBidi"/>
-          <w:color w:val="auto"/>
-          <w:sz w:val="24"/>
-          <w:szCs w:val="24"/>
-        </w:rPr>
         <w:t>This may include determining whether a required authorization or consent check needs to occur before a verification request is sent. The specific approach will depend on the provider, program, data source, and approved use case.</w:t>
       </w:r>
     </w:p>
     <w:p>
-      <w:pPr>
-        <w:pStyle w:val="Heading1"/>
-        <w:rPr>
-          <w:rFonts w:asciiTheme="minorHAnsi" w:eastAsiaTheme="minorHAnsi" w:hAnsiTheme="minorHAnsi" w:cstheme="minorBidi"/>
-          <w:color w:val="auto"/>
-          <w:sz w:val="24"/>
-          <w:szCs w:val="24"/>
-        </w:rPr>
-      </w:pPr>
-      <w:r>
-        <w:rPr>
-          <w:rFonts w:asciiTheme="minorHAnsi" w:eastAsiaTheme="minorHAnsi" w:hAnsiTheme="minorHAnsi" w:cstheme="minorBidi"/>
-          <w:color w:val="auto"/>
-          <w:sz w:val="24"/>
-          <w:szCs w:val="24"/>
-        </w:rPr>
+      <w:r>
         <w:t>A factor should not be presented as available until the source, permitted purpose, authority, agreement needs, technical path, and support needs are understood well enough to guide users.</w:t>
       </w:r>
     </w:p>
@@ -1255,15 +1056,7 @@
         </w:numPr>
       </w:pPr>
       <w:r>
-        <w:t xml:space="preserve">How long </w:t>
-      </w:r>
-      <w:proofErr w:type="gramStart"/>
-      <w:r>
-        <w:t>records or consent evidence must</w:t>
-      </w:r>
-      <w:proofErr w:type="gramEnd"/>
-      <w:r>
-        <w:t xml:space="preserve"> be retained</w:t>
+        <w:t>How long records or consent evidence must be retained</w:t>
       </w:r>
     </w:p>
     <w:p>
@@ -1459,7 +1252,7 @@
 </file>
 
 <file path=word/numbering.xml><?xml version="1.0" encoding="utf-8"?>
-<w:numbering xmlns:wpc="http://schemas.microsoft.com/office/word/2010/wordprocessingCanvas" xmlns:cx="http://schemas.microsoft.com/office/drawing/2014/chartex" xmlns:cx1="http://schemas.microsoft.com/office/drawing/2015/9/8/chartex" xmlns:cx2="http://schemas.microsoft.com/office/drawing/2015/10/21/chartex" xmlns:cx3="http://schemas.microsoft.com/office/drawing/2016/5/9/chartex" xmlns:cx4="http://schemas.microsoft.com/office/drawing/2016/5/10/chartex" xmlns:cx5="http://schemas.microsoft.com/office/drawing/2016/5/11/chartex" xmlns:cx6="http://schemas.microsoft.com/office/drawing/2016/5/12/chartex" xmlns:cx7="http://schemas.microsoft.com/office/drawing/2016/5/13/chartex" xmlns:cx8="http://schemas.microsoft.com/office/drawing/2016/5/14/chartex" xmlns:mc="http://schemas.openxmlformats.org/markup-compatibility/2006" xmlns:aink="http://schemas.microsoft.com/office/drawing/2016/ink" xmlns:am3d="http://schemas.microsoft.com/office/drawing/2017/model3d" xmlns:o="urn:schemas-microsoft-com:office:office" xmlns:oel="http://schemas.microsoft.com/office/2019/extlst" xmlns:r="http://schemas.openxmlformats.org/officeDocument/2006/relationships" xmlns:m="http://schemas.openxmlformats.org/officeDocument/2006/math" xmlns:v="urn:schemas-microsoft-com:vml" xmlns:wp14="http://schemas.microsoft.com/office/word/2010/wordprocessingDrawing" xmlns:wp="http://schemas.openxmlformats.org/drawingml/2006/wordprocessingDrawing" xmlns:w10="urn:schemas-microsoft-com:office:word" xmlns:w="http://schemas.openxmlformats.org/wordprocessingml/2006/main" xmlns:w14="http://schemas.microsoft.com/office/word/2010/wordml" xmlns:w15="http://schemas.microsoft.com/office/word/2012/wordml" xmlns:w16cex="http://schemas.microsoft.com/office/word/2018/wordml/cex" xmlns:w16cid="http://schemas.microsoft.com/office/word/2016/wordml/cid" xmlns:w16="http://schemas.microsoft.com/office/word/2018/wordml" xmlns:w16du="http://schemas.microsoft.com/office/word/2023/wordml/word16du" xmlns:w16sdtdh="http://schemas.microsoft.com/office/word/2020/wordml/sdtdatahash" xmlns:w16sdtfl="http://schemas.microsoft.com/office/word/2024/wordml/sdtformatlock" xmlns:w16se="http://schemas.microsoft.com/office/word/2015/wordml/symex" xmlns:wpg="http://schemas.microsoft.com/office/word/2010/wordprocessingGroup" xmlns:wpi="http://schemas.microsoft.com/office/word/2010/wordprocessingInk" xmlns:wne="http://schemas.microsoft.com/office/word/2006/wordml" xmlns:wps="http://schemas.microsoft.com/office/word/2010/wordprocessingShape" mc:Ignorable="w14 w15 w16se w16cid w16 w16cex w16sdtdh w16sdtfl w16du wp14">
+<w:numbering xmlns:wpc="http://schemas.microsoft.com/office/word/2010/wordprocessingCanvas" xmlns:cx="http://schemas.microsoft.com/office/drawing/2014/chartex" xmlns:cx1="http://schemas.microsoft.com/office/drawing/2015/9/8/chartex" xmlns:cx2="http://schemas.microsoft.com/office/drawing/2015/10/21/chartex" xmlns:cx3="http://schemas.microsoft.com/office/drawing/2016/5/9/chartex" xmlns:cx4="http://schemas.microsoft.com/office/drawing/2016/5/10/chartex" xmlns:cx5="http://schemas.microsoft.com/office/drawing/2016/5/11/chartex" xmlns:cx6="http://schemas.microsoft.com/office/drawing/2016/5/12/chartex" xmlns:cx7="http://schemas.microsoft.com/office/drawing/2016/5/13/chartex" xmlns:cx8="http://schemas.microsoft.com/office/drawing/2016/5/14/chartex" xmlns:mc="http://schemas.openxmlformats.org/markup-compatibility/2006" xmlns:m="http://schemas.openxmlformats.org/officeDocument/2006/math" xmlns:aink="http://schemas.microsoft.com/office/drawing/2016/ink" xmlns:am3d="http://schemas.microsoft.com/office/drawing/2017/model3d" xmlns:oel="http://schemas.microsoft.com/office/2019/extlst" xmlns:r="http://schemas.openxmlformats.org/officeDocument/2006/relationships" xmlns:wp14="http://schemas.microsoft.com/office/word/2010/wordprocessingDrawing" xmlns:wp="http://schemas.openxmlformats.org/drawingml/2006/wordprocessingDrawing" xmlns:wpg="http://schemas.microsoft.com/office/word/2010/wordprocessingGroup" xmlns:wpi="http://schemas.microsoft.com/office/word/2010/wordprocessingInk" xmlns:wps="http://schemas.microsoft.com/office/word/2010/wordprocessingShape" xmlns:o="urn:schemas-microsoft-com:office:office" xmlns:v="urn:schemas-microsoft-com:vml" xmlns:w10="urn:schemas-microsoft-com:office:word" xmlns:w="http://schemas.openxmlformats.org/wordprocessingml/2006/main" xmlns:w14="http://schemas.microsoft.com/office/word/2010/wordml" xmlns:w15="http://schemas.microsoft.com/office/word/2012/wordml" xmlns:w16cex="http://schemas.microsoft.com/office/word/2018/wordml/cex" xmlns:w16cid="http://schemas.microsoft.com/office/word/2016/wordml/cid" xmlns:w16="http://schemas.microsoft.com/office/word/2018/wordml" xmlns:w16sdtdh="http://schemas.microsoft.com/office/word/2020/wordml/sdtdatahash" xmlns:w16sdtfl="http://schemas.microsoft.com/office/word/2024/wordml/sdtformatlock" xmlns:w16se="http://schemas.microsoft.com/office/word/2015/wordml/symex" xmlns:w16du="http://schemas.microsoft.com/office/word/2023/wordml/word16du" xmlns:wne="http://schemas.microsoft.com/office/word/2006/wordml" mc:Ignorable="w14 w15 w16se w16cid w16 w16cex w16sdtdh w16sdtfl w16du wp14">
   <w:abstractNum w:abstractNumId="0" w15:restartNumberingAfterBreak="0">
     <w:nsid w:val="049A3262"/>
     <w:multiLevelType w:val="hybridMultilevel"/>
@@ -5376,7 +5169,7 @@
 </file>
 
 <file path=word/styles.xml><?xml version="1.0" encoding="utf-8"?>
-<w:styles xmlns:mc="http://schemas.openxmlformats.org/markup-compatibility/2006" xmlns:r="http://schemas.openxmlformats.org/officeDocument/2006/relationships" xmlns:w="http://schemas.openxmlformats.org/wordprocessingml/2006/main" xmlns:w14="http://schemas.microsoft.com/office/word/2010/wordml" xmlns:w15="http://schemas.microsoft.com/office/word/2012/wordml" xmlns:w16cex="http://schemas.microsoft.com/office/word/2018/wordml/cex" xmlns:w16cid="http://schemas.microsoft.com/office/word/2016/wordml/cid" xmlns:w16="http://schemas.microsoft.com/office/word/2018/wordml" xmlns:w16du="http://schemas.microsoft.com/office/word/2023/wordml/word16du" xmlns:w16sdtdh="http://schemas.microsoft.com/office/word/2020/wordml/sdtdatahash" xmlns:w16sdtfl="http://schemas.microsoft.com/office/word/2024/wordml/sdtformatlock" xmlns:w16se="http://schemas.microsoft.com/office/word/2015/wordml/symex" mc:Ignorable="w14 w15 w16se w16cid w16 w16cex w16sdtdh w16sdtfl w16du">
+<w:styles xmlns:mc="http://schemas.openxmlformats.org/markup-compatibility/2006" xmlns:r="http://schemas.openxmlformats.org/officeDocument/2006/relationships" xmlns:w="http://schemas.openxmlformats.org/wordprocessingml/2006/main" xmlns:w14="http://schemas.microsoft.com/office/word/2010/wordml" xmlns:w15="http://schemas.microsoft.com/office/word/2012/wordml" xmlns:w16cex="http://schemas.microsoft.com/office/word/2018/wordml/cex" xmlns:w16cid="http://schemas.microsoft.com/office/word/2016/wordml/cid" xmlns:w16="http://schemas.microsoft.com/office/word/2018/wordml" xmlns:w16sdtdh="http://schemas.microsoft.com/office/word/2020/wordml/sdtdatahash" xmlns:w16sdtfl="http://schemas.microsoft.com/office/word/2024/wordml/sdtformatlock" xmlns:w16se="http://schemas.microsoft.com/office/word/2015/wordml/symex" xmlns:w16du="http://schemas.microsoft.com/office/word/2023/wordml/word16du" mc:Ignorable="w14 w15 w16se w16cid w16 w16cex w16sdtdh w16sdtfl w16du">
   <w:docDefaults>
     <w:rPrDefault>
       <w:rPr>
@@ -6939,15 +6732,6 @@
 </file>
 
 <file path=customXml/item2.xml><?xml version="1.0" encoding="utf-8"?>
-<?mso-contentType ?>
-<FormTemplates xmlns="http://schemas.microsoft.com/sharepoint/v3/contenttype/forms">
-  <Display>DocumentLibraryForm</Display>
-  <Edit>DocumentLibraryForm</Edit>
-  <New>DocumentLibraryForm</New>
-</FormTemplates>
-</file>
-
-<file path=customXml/item3.xml><?xml version="1.0" encoding="utf-8"?>
 <p:properties xmlns:p="http://schemas.microsoft.com/office/2006/metadata/properties" xmlns:xsi="http://www.w3.org/2001/XMLSchema-instance" xmlns:pc="http://schemas.microsoft.com/office/infopath/2007/PartnerControls">
   <documentManagement>
     <lcf76f155ced4ddcb4097134ff3c332f xmlns="39f3446f-e6da-4805-994a-13bbd6dccf18">
@@ -6960,14 +6744,49 @@
 </p:properties>
 </file>
 
+<file path=customXml/item3.xml><?xml version="1.0" encoding="utf-8"?>
+<?mso-contentType ?>
+<FormTemplates xmlns="http://schemas.microsoft.com/sharepoint/v3/contenttype/forms">
+  <Display>DocumentLibraryForm</Display>
+  <Edit>DocumentLibraryForm</Edit>
+  <New>DocumentLibraryForm</New>
+</FormTemplates>
+</file>
+
 <file path=customXml/itemProps1.xml><?xml version="1.0" encoding="utf-8"?>
-<ds:datastoreItem xmlns:ds="http://schemas.openxmlformats.org/officeDocument/2006/customXml" ds:itemID="{B6895352-F67C-490A-8E1F-CDE04FAF02C6}"/>
+<ds:datastoreItem xmlns:ds="http://schemas.openxmlformats.org/officeDocument/2006/customXml" ds:itemID="{B6895352-F67C-490A-8E1F-CDE04FAF02C6}">
+  <ds:schemaRefs>
+    <ds:schemaRef ds:uri="http://schemas.microsoft.com/office/2006/metadata/contentType"/>
+    <ds:schemaRef ds:uri="http://schemas.microsoft.com/office/2006/metadata/properties/metaAttributes"/>
+    <ds:schemaRef ds:uri="http://www.w3.org/2001/XMLSchema"/>
+    <ds:schemaRef ds:uri="http://schemas.microsoft.com/office/2006/metadata/properties"/>
+    <ds:schemaRef ds:uri="39f3446f-e6da-4805-994a-13bbd6dccf18"/>
+    <ds:schemaRef ds:uri="b22fc790-25fd-41db-90ab-657e83ed8416"/>
+    <ds:schemaRef ds:uri="http://schemas.microsoft.com/office/2006/documentManagement/types"/>
+    <ds:schemaRef ds:uri="http://schemas.microsoft.com/office/infopath/2007/PartnerControls"/>
+    <ds:schemaRef ds:uri="http://schemas.openxmlformats.org/package/2006/metadata/core-properties"/>
+    <ds:schemaRef ds:uri="http://purl.org/dc/elements/1.1/"/>
+    <ds:schemaRef ds:uri="http://purl.org/dc/terms/"/>
+    <ds:schemaRef ds:uri="http://schemas.microsoft.com/internal/obd"/>
+  </ds:schemaRefs>
+</ds:datastoreItem>
 </file>
 
 <file path=customXml/itemProps2.xml><?xml version="1.0" encoding="utf-8"?>
-<ds:datastoreItem xmlns:ds="http://schemas.openxmlformats.org/officeDocument/2006/customXml" ds:itemID="{A2630915-1B1A-44BB-96BB-98F5668D3FA0}"/>
+<ds:datastoreItem xmlns:ds="http://schemas.openxmlformats.org/officeDocument/2006/customXml" ds:itemID="{349B8A1A-C8D3-4339-9418-002C153E84D4}">
+  <ds:schemaRefs>
+    <ds:schemaRef ds:uri="http://schemas.microsoft.com/office/2006/metadata/properties"/>
+    <ds:schemaRef ds:uri="http://schemas.microsoft.com/office/infopath/2007/PartnerControls"/>
+    <ds:schemaRef ds:uri="39f3446f-e6da-4805-994a-13bbd6dccf18"/>
+    <ds:schemaRef ds:uri="b22fc790-25fd-41db-90ab-657e83ed8416"/>
+  </ds:schemaRefs>
+</ds:datastoreItem>
 </file>
 
 <file path=customXml/itemProps3.xml><?xml version="1.0" encoding="utf-8"?>
-<ds:datastoreItem xmlns:ds="http://schemas.openxmlformats.org/officeDocument/2006/customXml" ds:itemID="{349B8A1A-C8D3-4339-9418-002C153E84D4}"/>
+<ds:datastoreItem xmlns:ds="http://schemas.openxmlformats.org/officeDocument/2006/customXml" ds:itemID="{A2630915-1B1A-44BB-96BB-98F5668D3FA0}">
+  <ds:schemaRefs>
+    <ds:schemaRef ds:uri="http://schemas.microsoft.com/sharepoint/v3/contenttype/forms"/>
+  </ds:schemaRefs>
+</ds:datastoreItem>
 </file>
</xml_diff>